<commit_message>
Fix Compromiso con la Etica - Cyrgo
</commit_message>
<xml_diff>
--- a/webapp/templates/word/Compromiso_Etica_Cyrgo.docx
+++ b/webapp/templates/word/Compromiso_Etica_Cyrgo.docx
@@ -19,7 +19,7 @@
         <mc:AlternateContent>
           <mc:Choice Requires="wpg">
             <w:drawing>
-              <wp:anchor distT="0" distB="0" distL="0" distR="0" simplePos="0" relativeHeight="487556096" behindDoc="1" locked="0" layoutInCell="1" allowOverlap="1" wp14:anchorId="3D93416E" wp14:editId="5542005C">
+              <wp:anchor distT="0" distB="0" distL="0" distR="0" simplePos="0" relativeHeight="487556096" behindDoc="1" locked="0" layoutInCell="1" allowOverlap="1" wp14:anchorId="3D93416E" wp14:editId="6F9050D2">
                 <wp:simplePos x="0" y="0"/>
                 <wp:positionH relativeFrom="page">
                   <wp:posOffset>109221</wp:posOffset>
@@ -54,7 +54,7 @@
                           <pic:cNvPicPr/>
                         </pic:nvPicPr>
                         <pic:blipFill>
-                          <a:blip r:embed="rId4" cstate="print"/>
+                          <a:blip r:embed="rId5" cstate="print"/>
                           <a:stretch>
                             <a:fillRect/>
                           </a:stretch>
@@ -267,7 +267,7 @@
           </mc:Choice>
           <mc:Fallback>
             <w:pict>
-              <v:group w14:anchorId="4271E8CF" id="Group 1" o:spid="_x0000_s1026" style="position:absolute;margin-left:8.6pt;margin-top:0;width:594.45pt;height:791.7pt;z-index:-15760384;mso-wrap-distance-left:0;mso-wrap-distance-right:0;mso-position-horizontal-relative:page;mso-position-vertical-relative:page" coordsize="75495,100545" o:gfxdata="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">
+              <v:group w14:anchorId="3A030E82" id="Group 1" o:spid="_x0000_s1026" style="position:absolute;margin-left:8.6pt;margin-top:0;width:594.45pt;height:791.7pt;z-index:-15760384;mso-wrap-distance-left:0;mso-wrap-distance-right:0;mso-position-horizontal-relative:page;mso-position-vertical-relative:page" coordsize="75495,100545" o:gfxdata="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">
                 <v:shapetype id="_x0000_t75" coordsize="21600,21600" o:spt="75" o:preferrelative="t" path="m@4@5l@4@11@9@11@9@5xe" filled="f" stroked="f">
                   <v:stroke joinstyle="miter"/>
                   <v:formulas>
@@ -288,7 +288,7 @@
                   <o:lock v:ext="edit" aspectratio="t"/>
                 </v:shapetype>
                 <v:shape id="Image 2" o:spid="_x0000_s1027" type="#_x0000_t75" style="position:absolute;width:75492;height:100545;visibility:visible;mso-wrap-style:square" o:gfxdata="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">
-                  <v:imagedata r:id="rId5" o:title=""/>
+                  <v:imagedata r:id="rId6" o:title=""/>
                 </v:shape>
                 <v:shape id="Graphic 3" o:spid="_x0000_s1028" style="position:absolute;left:7194;top:75342;width:50768;height:14478;visibility:visible;mso-wrap-style:square;v-text-anchor:top" coordsize="5076825,1447800" o:gfxdata="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" path="m5076825,l,,,1447800r5076825,l5076825,xe" stroked="f">
                   <v:path arrowok="t"/>
@@ -555,252 +555,78 @@
     </w:p>
     <w:p>
       <w:pPr>
-        <w:pStyle w:val="Textoindependiente"/>
-        <w:spacing w:before="1"/>
-        <w:ind w:left="106"/>
+        <w:pStyle w:val="Ttulo2"/>
+        <w:rPr>
+          <w:rFonts w:ascii="Arial" w:hAnsi="Arial" w:cs="Arial"/>
+          <w:b/>
+          <w:bCs/>
+          <w:color w:val="10467A"/>
+        </w:rPr>
       </w:pPr>
       <w:r>
         <w:rPr>
-          <w:color w:val="4F81BC"/>
-          <w:spacing w:val="-2"/>
-        </w:rPr>
-        <w:t>Firm</w:t>
+          <w:rFonts w:ascii="Arial" w:hAnsi="Arial" w:cs="Arial"/>
+          <w:b/>
+          <w:bCs/>
+          <w:color w:val="10467A"/>
+        </w:rPr>
+        <w:t>Firma</w:t>
       </w:r>
+    </w:p>
+    <w:p>
+      <w:pPr>
+        <w:rPr>
+          <w:sz w:val="26"/>
+          <w:szCs w:val="26"/>
+        </w:rPr>
+      </w:pPr>
+    </w:p>
+    <w:p>
+      <w:pPr>
+        <w:pStyle w:val="Ttulo2"/>
+        <w:rPr>
+          <w:rFonts w:ascii="Arial" w:hAnsi="Arial" w:cs="Arial"/>
+          <w:color w:val="10467A"/>
+        </w:rPr>
+      </w:pPr>
       <w:r>
         <w:rPr>
-          <w:color w:val="4F81BC"/>
-          <w:spacing w:val="-2"/>
-        </w:rPr>
-        <w:t>a</w:t>
+          <w:rFonts w:ascii="Arial" w:hAnsi="Arial" w:cs="Arial"/>
+          <w:color w:val="10467A"/>
+        </w:rPr>
+        <w:t>Nombre del empleado: [[Nombre]]</w:t>
       </w:r>
     </w:p>
     <w:p>
       <w:pPr>
-        <w:spacing w:before="339"/>
-        <w:ind w:left="485"/>
-        <w:rPr>
-          <w:sz w:val="28"/>
+        <w:pStyle w:val="Ttulo2"/>
+        <w:rPr>
+          <w:rFonts w:ascii="Arial" w:hAnsi="Arial" w:cs="Arial"/>
+          <w:color w:val="10467A"/>
         </w:rPr>
       </w:pPr>
       <w:r>
         <w:rPr>
-          <w:b/>
-          <w:color w:val="4F81BC"/>
-          <w:sz w:val="28"/>
-        </w:rPr>
-        <w:t>No</w:t>
+          <w:rFonts w:ascii="Arial" w:hAnsi="Arial" w:cs="Arial"/>
+          <w:color w:val="10467A"/>
+        </w:rPr>
+        <w:t>Número de cedula: [[Cedula]]</w:t>
       </w:r>
+    </w:p>
+    <w:p>
+      <w:pPr>
+        <w:pStyle w:val="Ttulo2"/>
+        <w:rPr>
+          <w:rFonts w:ascii="Arial" w:hAnsi="Arial" w:cs="Arial"/>
+          <w:color w:val="10467A"/>
+        </w:rPr>
+      </w:pPr>
       <w:r>
         <w:rPr>
-          <w:b/>
-          <w:color w:val="4F81BC"/>
-          <w:sz w:val="28"/>
-        </w:rPr>
-        <w:t>mbre</w:t>
-      </w:r>
-      <w:r>
-        <w:rPr>
-          <w:b/>
-          <w:color w:val="4F81BC"/>
-          <w:spacing w:val="-10"/>
-          <w:sz w:val="28"/>
-        </w:rPr>
-        <w:t xml:space="preserve"> </w:t>
-      </w:r>
-      <w:r>
-        <w:rPr>
-          <w:b/>
-          <w:color w:val="4F81BC"/>
-          <w:sz w:val="28"/>
-        </w:rPr>
-        <w:t>del</w:t>
-      </w:r>
-      <w:r>
-        <w:rPr>
-          <w:b/>
-          <w:color w:val="4F81BC"/>
-          <w:spacing w:val="-10"/>
-          <w:sz w:val="28"/>
-        </w:rPr>
-        <w:t xml:space="preserve"> </w:t>
-      </w:r>
-      <w:r>
-        <w:rPr>
-          <w:b/>
-          <w:color w:val="4F81BC"/>
-          <w:sz w:val="28"/>
-        </w:rPr>
-        <w:t>empleado:</w:t>
-      </w:r>
-      <w:r>
-        <w:rPr>
-          <w:b/>
-          <w:color w:val="4F81BC"/>
-          <w:spacing w:val="-2"/>
-          <w:sz w:val="28"/>
-        </w:rPr>
-        <w:t xml:space="preserve"> </w:t>
-      </w:r>
-      <w:r>
-        <w:rPr>
-          <w:color w:val="4F81BC"/>
-          <w:spacing w:val="-2"/>
-          <w:sz w:val="28"/>
-        </w:rPr>
-        <w:t>[[Nombre]]</w:t>
-      </w:r>
-    </w:p>
-    <w:p>
-      <w:pPr>
-        <w:spacing w:before="52"/>
-        <w:ind w:left="485"/>
-        <w:rPr>
-          <w:sz w:val="28"/>
-        </w:rPr>
-      </w:pPr>
-      <w:r>
-        <w:rPr>
-          <w:b/>
-          <w:color w:val="4F81BC"/>
-          <w:sz w:val="28"/>
-        </w:rPr>
-        <w:t>Número</w:t>
-      </w:r>
-      <w:r>
-        <w:rPr>
-          <w:b/>
-          <w:color w:val="4F81BC"/>
-          <w:spacing w:val="-9"/>
-          <w:sz w:val="28"/>
-        </w:rPr>
-        <w:t xml:space="preserve"> </w:t>
-      </w:r>
-      <w:r>
-        <w:rPr>
-          <w:b/>
-          <w:color w:val="4F81BC"/>
-          <w:sz w:val="28"/>
-        </w:rPr>
-        <w:t>de</w:t>
-      </w:r>
-      <w:r>
-        <w:rPr>
-          <w:b/>
-          <w:color w:val="4F81BC"/>
-          <w:spacing w:val="-9"/>
-          <w:sz w:val="28"/>
-        </w:rPr>
-        <w:t xml:space="preserve"> </w:t>
-      </w:r>
-      <w:r>
-        <w:rPr>
-          <w:b/>
-          <w:color w:val="4F81BC"/>
-          <w:sz w:val="28"/>
-        </w:rPr>
-        <w:t>cedula:</w:t>
-      </w:r>
-      <w:r>
-        <w:rPr>
-          <w:b/>
-          <w:color w:val="4F81BC"/>
-          <w:spacing w:val="-1"/>
-          <w:sz w:val="28"/>
-        </w:rPr>
-        <w:t xml:space="preserve"> </w:t>
-      </w:r>
-      <w:r>
-        <w:rPr>
-          <w:color w:val="4F81BC"/>
-          <w:spacing w:val="-2"/>
-          <w:sz w:val="28"/>
-        </w:rPr>
-        <w:t>[[Cedula]]</w:t>
-      </w:r>
-    </w:p>
-    <w:p>
-      <w:pPr>
-        <w:spacing w:before="52"/>
-        <w:ind w:left="480"/>
-        <w:rPr>
-          <w:sz w:val="28"/>
-        </w:rPr>
-      </w:pPr>
-      <w:r>
-        <w:rPr>
-          <w:b/>
-          <w:color w:val="4F81BC"/>
-          <w:sz w:val="28"/>
-        </w:rPr>
-        <w:t>Fecha</w:t>
-      </w:r>
-      <w:r>
-        <w:rPr>
-          <w:b/>
-          <w:color w:val="4F81BC"/>
-          <w:spacing w:val="-6"/>
-          <w:sz w:val="28"/>
-        </w:rPr>
-        <w:t xml:space="preserve"> </w:t>
-      </w:r>
-      <w:r>
-        <w:rPr>
-          <w:b/>
-          <w:color w:val="4F81BC"/>
-          <w:sz w:val="28"/>
-        </w:rPr>
-        <w:t>firma</w:t>
-      </w:r>
-      <w:r>
-        <w:rPr>
-          <w:b/>
-          <w:color w:val="4F81BC"/>
-          <w:spacing w:val="-6"/>
-          <w:sz w:val="28"/>
-        </w:rPr>
-        <w:t xml:space="preserve"> </w:t>
-      </w:r>
-      <w:r>
-        <w:rPr>
-          <w:b/>
-          <w:color w:val="4F81BC"/>
-          <w:sz w:val="28"/>
-        </w:rPr>
-        <w:t>del</w:t>
-      </w:r>
-      <w:r>
-        <w:rPr>
-          <w:b/>
-          <w:color w:val="4F81BC"/>
-          <w:spacing w:val="-7"/>
-          <w:sz w:val="28"/>
-        </w:rPr>
-        <w:t xml:space="preserve"> </w:t>
-      </w:r>
-      <w:r>
-        <w:rPr>
-          <w:b/>
-          <w:color w:val="4F81BC"/>
-          <w:sz w:val="28"/>
-        </w:rPr>
-        <w:t>documento:</w:t>
-      </w:r>
-      <w:r>
-        <w:rPr>
-          <w:b/>
-          <w:color w:val="4F81BC"/>
-          <w:spacing w:val="-4"/>
-          <w:sz w:val="28"/>
-        </w:rPr>
-        <w:t xml:space="preserve"> </w:t>
-      </w:r>
-      <w:r>
-        <w:rPr>
-          <w:color w:val="4F81BC"/>
-          <w:spacing w:val="-2"/>
-          <w:sz w:val="28"/>
-        </w:rPr>
-        <w:t>[[Fecha]]</w:t>
+          <w:rFonts w:ascii="Arial" w:hAnsi="Arial" w:cs="Arial"/>
+          <w:color w:val="10467A"/>
+        </w:rPr>
+        <w:t>Fecha firma del documento: [[Fecha]]</w:t>
       </w:r>
     </w:p>
     <w:sectPr>
@@ -1218,6 +1044,28 @@
       <w:lang w:val="es-ES"/>
     </w:rPr>
   </w:style>
+  <w:style w:type="paragraph" w:styleId="Ttulo2">
+    <w:name w:val="heading 2"/>
+    <w:basedOn w:val="Normal"/>
+    <w:next w:val="Normal"/>
+    <w:link w:val="Ttulo2Car"/>
+    <w:uiPriority w:val="9"/>
+    <w:unhideWhenUsed/>
+    <w:qFormat/>
+    <w:rsid w:val="002254A1"/>
+    <w:pPr>
+      <w:keepNext/>
+      <w:keepLines/>
+      <w:spacing w:before="40"/>
+      <w:outlineLvl w:val="1"/>
+    </w:pPr>
+    <w:rPr>
+      <w:rFonts w:asciiTheme="majorHAnsi" w:eastAsiaTheme="majorEastAsia" w:hAnsiTheme="majorHAnsi" w:cstheme="majorBidi"/>
+      <w:color w:val="365F91" w:themeColor="accent1" w:themeShade="BF"/>
+      <w:sz w:val="26"/>
+      <w:szCs w:val="26"/>
+    </w:rPr>
+  </w:style>
   <w:style w:type="character" w:default="1" w:styleId="Fuentedeprrafopredeter">
     <w:name w:val="Default Paragraph Font"/>
     <w:uiPriority w:val="1"/>
@@ -1284,6 +1132,63 @@
     <w:basedOn w:val="Normal"/>
     <w:uiPriority w:val="1"/>
     <w:qFormat/>
+  </w:style>
+  <w:style w:type="paragraph" w:styleId="Sinespaciado">
+    <w:name w:val="No Spacing"/>
+    <w:uiPriority w:val="1"/>
+    <w:qFormat/>
+    <w:rsid w:val="00BC479D"/>
+    <w:rPr>
+      <w:rFonts w:ascii="Calibri" w:eastAsia="Calibri" w:hAnsi="Calibri" w:cs="Calibri"/>
+      <w:lang w:val="es-ES"/>
+    </w:rPr>
+  </w:style>
+  <w:style w:type="paragraph" w:styleId="Subttulo">
+    <w:name w:val="Subtitle"/>
+    <w:basedOn w:val="Normal"/>
+    <w:next w:val="Normal"/>
+    <w:link w:val="SubttuloCar"/>
+    <w:uiPriority w:val="11"/>
+    <w:qFormat/>
+    <w:rsid w:val="00BC479D"/>
+    <w:pPr>
+      <w:numPr>
+        <w:ilvl w:val="1"/>
+      </w:numPr>
+      <w:spacing w:after="160"/>
+    </w:pPr>
+    <w:rPr>
+      <w:rFonts w:asciiTheme="minorHAnsi" w:eastAsiaTheme="minorEastAsia" w:hAnsiTheme="minorHAnsi" w:cstheme="minorBidi"/>
+      <w:color w:val="5A5A5A" w:themeColor="text1" w:themeTint="A5"/>
+      <w:spacing w:val="15"/>
+    </w:rPr>
+  </w:style>
+  <w:style w:type="character" w:customStyle="1" w:styleId="SubttuloCar">
+    <w:name w:val="Subtítulo Car"/>
+    <w:basedOn w:val="Fuentedeprrafopredeter"/>
+    <w:link w:val="Subttulo"/>
+    <w:uiPriority w:val="11"/>
+    <w:rsid w:val="00BC479D"/>
+    <w:rPr>
+      <w:rFonts w:eastAsiaTheme="minorEastAsia"/>
+      <w:color w:val="5A5A5A" w:themeColor="text1" w:themeTint="A5"/>
+      <w:spacing w:val="15"/>
+      <w:lang w:val="es-ES"/>
+    </w:rPr>
+  </w:style>
+  <w:style w:type="character" w:customStyle="1" w:styleId="Ttulo2Car">
+    <w:name w:val="Título 2 Car"/>
+    <w:basedOn w:val="Fuentedeprrafopredeter"/>
+    <w:link w:val="Ttulo2"/>
+    <w:uiPriority w:val="9"/>
+    <w:rsid w:val="002254A1"/>
+    <w:rPr>
+      <w:rFonts w:asciiTheme="majorHAnsi" w:eastAsiaTheme="majorEastAsia" w:hAnsiTheme="majorHAnsi" w:cstheme="majorBidi"/>
+      <w:color w:val="365F91" w:themeColor="accent1" w:themeShade="BF"/>
+      <w:sz w:val="26"/>
+      <w:szCs w:val="26"/>
+      <w:lang w:val="es-ES"/>
+    </w:rPr>
   </w:style>
 </w:styles>
 </file>
@@ -1569,4 +1474,16 @@
   <a:objectDefaults/>
   <a:extraClrSchemeLst/>
 </a:theme>
+</file>
+
+<file path=customXml/item1.xml><?xml version="1.0" encoding="utf-8"?>
+<b:Sources xmlns:b="http://schemas.openxmlformats.org/officeDocument/2006/bibliography" xmlns="http://schemas.openxmlformats.org/officeDocument/2006/bibliography" SelectedStyle="\APASixthEditionOfficeOnline.xsl" StyleName="APA" Version="6"/>
+</file>
+
+<file path=customXml/itemProps1.xml><?xml version="1.0" encoding="utf-8"?>
+<ds:datastoreItem xmlns:ds="http://schemas.openxmlformats.org/officeDocument/2006/customXml" ds:itemID="{748D5884-9874-468E-BC7E-A8F98EA52C93}">
+  <ds:schemaRefs>
+    <ds:schemaRef ds:uri="http://schemas.openxmlformats.org/officeDocument/2006/bibliography"/>
+  </ds:schemaRefs>
+</ds:datastoreItem>
 </file>
</xml_diff>